<commit_message>
docs: verificar notas estados y adjuntos Android sobre MySQL compartido
</commit_message>
<xml_diff>
--- a/docs/informes/2026-10-21-sprint12/MAIN_Regularizacion_Sprint_12_octubre_2026.docx
+++ b/docs/informes/2026-10-21-sprint12/MAIN_Regularizacion_Sprint_12_octubre_2026.docx
@@ -624,7 +624,7 @@
               <w:rPr>
                 <w:sz w:val="20"/>
               </w:rPr>
-              <w:t>3 aprobadas  0 fallos</w:t>
+              <w:t>8 aprobadas  0 fallos</w:t>
             </w:r>
           </w:p>
         </w:tc>
@@ -640,7 +640,7 @@
               <w:rPr>
                 <w:sz w:val="20"/>
               </w:rPr>
-              <w:t>Registro Django, detalle y permisos en emulador</w:t>
+              <w:t>3 de arquitectura y 5 de notas, estados y adjuntos</w:t>
             </w:r>
           </w:p>
         </w:tc>
@@ -648,7 +648,7 @@
     </w:tbl>
     <w:p>
       <w:r>
-        <w:t>Los siete recorridos Android del informe del 20/10 corresponden a otro corte. No se presentan como repetidos sobre MySQL. El nuevo ensayo no acredita teléfono físico, producción ni todos los módulos del proyecto sobre MySQL.</w:t>
+        <w:t>Se aprobaron tres casos de arquitectura y una ejecución adicional de cinco recorridos de notas, estados y adjuntos sobre MySQL. Los siete del informe del 20/10 son otro corte. Estos ensayos no acreditan teléfono físico, producción ni todos los módulos del proyecto sobre MySQL.</w:t>
       </w:r>
     </w:p>
     <w:tbl>
@@ -1449,9 +1449,9 @@
         <w:br/>
         <w:t>4ec140e  Verificación Android del registro Django</w:t>
         <w:br/>
-        <w:t>6aa1122  Evidencias e informe factual</w:t>
+        <w:t>6aa1122 y 2c52a09  Evidencias e informes</w:t>
         <w:br/>
-        <w:t>d0f8d7e  Iniciador local y arquitectura actualizada</w:t>
+        <w:t>d0f8d7e y 84c8934  Iniciador local y procesamiento multimedia</w:t>
       </w:r>
     </w:p>
     <w:p>

</xml_diff>